<commit_message>
Re-run every simulation study with the corrected engine; update the IEEE report
All studies re-run after fixing the Thompson-sampling prior (previously
counted twice): main comparison, component ablation, significance tests,
replay, trace analysis, learning outcomes, fixed-mode/theme ablations.

New robustness study (research/run_sensitivity.py): weak/strong
preferences, easily upset children and five labelled synthetic archetypes
plus a mixed population. AURA had the lowest regret in all ten scenarios.

Honest changes in the numbers: regret improved (8.30 -> 7.13) and
personalization accuracy rose, but 7-day retention fell (91.1 -> 87.0) and
is no longer significantly above the heuristic baseline; the fixed-mode
retention effect disappeared. The report now says so. Adaptive difficulty
is active in these runs but unmeasured (the simulator has no difficulty
model). Also adds docs/md2docx.py to rebuild the Word report.

Co-Authored-By: Claude Sonnet 5.5 <noreply@anthropic.com>
</commit_message>
<xml_diff>
--- a/docs/IEEE_REPORT.docx
+++ b/docs/IEEE_REPORT.docx
@@ -31,7 +31,7 @@
     </w:p>
     <w:p>
       <w:r>
-        <w:t>Autistic children respond very differently to the same teaching content, and existing adaptive learning systems either adapt only difficulty or apply one model learned from many children to each individual. We present AURA, an adaptive learning system for autistic children with two contributions. First, a per-child causal personalization engine that runs randomized within-child comparisons of teaching method, response mode, interest theme and re-engagement support, using Thompson sampling with a credible-interval stopping rule, drift re-testing, a distress-triggered safety layer and clinician arm-locks. In a paired simulation of 80 children it reduced cumulative regret by 67% against a static system (8.30 vs 25.09) and was significantly better than all five baselines. Second, an autism-specific visual-attention model (ResNet-50 encoder, multi-scale decoder, typical-attention head plus an explicit difference head) trained on the Saliency4ASD eye-tracking data. In 5-fold cross-validation it predicted autistic children's gaze significantly better than a general children's-attention model on five of six standard metrics, predicted the share of autistic gaze on 924 labelled objects with Spearman ρ = 0.850, and was used to edit learning images, raising predicted attention on the teaching target from 0.030 to 0.066.</w:t>
+        <w:t>Autistic children respond very differently to the same teaching content, and existing adaptive learning systems either adapt only difficulty or apply one model learned from many children to each individual. We present AURA, an adaptive learning system for autistic children with two contributions. First, a per-child causal personalization engine that runs randomized within-child comparisons of teaching method, response mode, interest theme and re-engagement support, using Thompson sampling with a credible-interval stopping rule, drift re-testing, a distress-triggered safety layer and clinician arm-locks. In a paired simulation of 80 children it reduced cumulative regret by 72% against a static system (7.13 vs 25.09, d_z = −0.72, p &lt; 0.0001) and was significantly better than all five baselines on regret; it had the lowest regret in all ten robustness scenarios, including five synthetic child archetypes. Second, an autism-specific visual-attention model (ResNet-50 encoder, multi-scale decoder, typical-attention head plus an explicit difference head) trained on the Saliency4ASD eye-tracking data. In 5-fold cross-validation it predicted autistic children's gaze significantly better than a general children's-attention model on five of six standard metrics, predicted the share of autistic gaze on 924 labelled objects with Spearman ρ = 0.850, and was used to edit learning images, raising predicted attention on the teaching target from 0.030 to 0.066.</w:t>
       </w:r>
     </w:p>
     <w:p>
@@ -197,7 +197,7 @@
               <w:rPr>
                 <w:sz w:val="18"/>
               </w:rPr>
-              <w:t>Built; validated in simulation and one replayed published case</w:t>
+              <w:t>Built; validated in simulation (including a robustness study) and one replayed published case</w:t>
             </w:r>
           </w:p>
         </w:tc>
@@ -214,7 +214,7 @@
               <w:rPr>
                 <w:sz w:val="18"/>
               </w:rPr>
-              <w:t>§6.3–6.6</w:t>
+              <w:t>§6.3–6.8</w:t>
             </w:r>
           </w:p>
         </w:tc>
@@ -1349,7 +1349,7 @@
         <w:t>Difficulty.</w:t>
       </w:r>
       <w:r>
-        <w:t xml:space="preserve"> Levels 1–3 per topic, moved one level per activity from the child's last activity on that topic (accuracy ≥ 0.8 with fast responses steps up; accuracy &lt; 0.55 or slow or repeated attempts steps down). Added after the simulation studies; the simulated child does not model difficulty.</w:t>
+        <w:t xml:space="preserve"> Levels 1–3 per topic, moved one level per activity from the child's last activity on that topic (accuracy ≥ 0.8 with fast responses steps up; accuracy &lt; 0.55 or slow or repeated attempts steps down). Active in the re-run studies below, but the simulated child's accuracy does not depend on difficulty, so its effect on learning is not measured.</w:t>
       </w:r>
     </w:p>
     <w:p>
@@ -1928,6 +1928,93 @@
               <w:rPr>
                 <w:sz w:val="18"/>
               </w:rPr>
+              <w:t>Robustness (§6.8)</w:t>
+            </w:r>
+          </w:p>
+        </w:tc>
+        <w:tc>
+          <w:tcPr>
+            <w:tcW w:type="dxa" w:w="1949"/>
+          </w:tcPr>
+          <w:p>
+            <w:pPr>
+              <w:spacing w:after="20"/>
+            </w:pPr>
+            <w:r/>
+            <w:r>
+              <w:rPr>
+                <w:sz w:val="18"/>
+              </w:rPr>
+              <w:t>40 per scenario</w:t>
+            </w:r>
+          </w:p>
+        </w:tc>
+        <w:tc>
+          <w:tcPr>
+            <w:tcW w:type="dxa" w:w="1949"/>
+          </w:tcPr>
+          <w:p>
+            <w:pPr>
+              <w:spacing w:after="20"/>
+            </w:pPr>
+            <w:r/>
+            <w:r>
+              <w:rPr>
+                <w:sz w:val="18"/>
+              </w:rPr>
+              <w:t>40</w:t>
+            </w:r>
+          </w:p>
+        </w:tc>
+        <w:tc>
+          <w:tcPr>
+            <w:tcW w:type="dxa" w:w="1949"/>
+          </w:tcPr>
+          <w:p>
+            <w:pPr>
+              <w:spacing w:after="20"/>
+            </w:pPr>
+            <w:r/>
+            <w:r>
+              <w:rPr>
+                <w:sz w:val="18"/>
+              </w:rPr>
+              <w:t>AURA, static, heuristic × 10 scenarios</w:t>
+            </w:r>
+          </w:p>
+        </w:tc>
+        <w:tc>
+          <w:tcPr>
+            <w:tcW w:type="dxa" w:w="1949"/>
+          </w:tcPr>
+          <w:p>
+            <w:pPr>
+              <w:spacing w:after="20"/>
+            </w:pPr>
+            <w:r/>
+            <w:r>
+              <w:rPr>
+                <w:sz w:val="18"/>
+              </w:rPr>
+              <w:t>44</w:t>
+            </w:r>
+          </w:p>
+        </w:tc>
+      </w:tr>
+      <w:tr>
+        <w:tc>
+          <w:tcPr>
+            <w:tcW w:type="dxa" w:w="1949"/>
+          </w:tcPr>
+          <w:p>
+            <w:pPr>
+              <w:spacing w:after="20"/>
+            </w:pPr>
+            <w:r/>
+            <w:r>
+              <w:rPr>
+                <w:sz w:val="18"/>
+              </w:rPr>
               <w:t>Replay</w:t>
             </w:r>
           </w:p>
@@ -2545,7 +2632,7 @@
               <w:rPr>
                 <w:sz w:val="18"/>
               </w:rPr>
-              <w:t>not measured: difficulty was wired into the engine after the simulation studies and the simulator has no difficulty model</w:t>
+              <w:t>not measured: the simulated child does not model difficulty; measure in the pilot</w:t>
             </w:r>
           </w:p>
         </w:tc>
@@ -3548,7 +3635,7 @@
                 <w:b/>
                 <w:sz w:val="18"/>
               </w:rPr>
-              <w:t>8.30 ± 7.64</w:t>
+              <w:t>7.13 ± 8.28</w:t>
             </w:r>
           </w:p>
         </w:tc>
@@ -3563,10 +3650,27 @@
             <w:r/>
             <w:r>
               <w:rPr>
+                <w:sz w:val="18"/>
+              </w:rPr>
+              <w:t>87.0</w:t>
+            </w:r>
+          </w:p>
+        </w:tc>
+        <w:tc>
+          <w:tcPr>
+            <w:tcW w:type="dxa" w:w="1218"/>
+          </w:tcPr>
+          <w:p>
+            <w:pPr>
+              <w:spacing w:after="20"/>
+            </w:pPr>
+            <w:r/>
+            <w:r>
+              <w:rPr>
                 <w:b/>
                 <w:sz w:val="18"/>
               </w:rPr>
-              <w:t>91.1</w:t>
+              <w:t>0.51</w:t>
             </w:r>
           </w:p>
         </w:tc>
@@ -3584,7 +3688,7 @@
                 <w:b/>
                 <w:sz w:val="18"/>
               </w:rPr>
-              <w:t>0.44</w:t>
+              <w:t>92.0</w:t>
             </w:r>
           </w:p>
         </w:tc>
@@ -3602,7 +3706,7 @@
                 <w:b/>
                 <w:sz w:val="18"/>
               </w:rPr>
-              <w:t>91.3</w:t>
+              <w:t>+7.9</w:t>
             </w:r>
           </w:p>
         </w:tc>
@@ -3620,7 +3724,7 @@
                 <w:b/>
                 <w:sz w:val="18"/>
               </w:rPr>
-              <w:t>+9.4</w:t>
+              <w:t>98.0</w:t>
             </w:r>
           </w:p>
         </w:tc>
@@ -3638,25 +3742,7 @@
                 <w:b/>
                 <w:sz w:val="18"/>
               </w:rPr>
-              <w:t>97.5</w:t>
-            </w:r>
-          </w:p>
-        </w:tc>
-        <w:tc>
-          <w:tcPr>
-            <w:tcW w:type="dxa" w:w="1218"/>
-          </w:tcPr>
-          <w:p>
-            <w:pPr>
-              <w:spacing w:after="20"/>
-            </w:pPr>
-            <w:r/>
-            <w:r>
-              <w:rPr>
-                <w:b/>
-                <w:sz w:val="18"/>
-              </w:rPr>
-              <w:t>95</w:t>
+              <w:t>94</w:t>
             </w:r>
           </w:p>
         </w:tc>
@@ -3669,7 +3755,97 @@
     </w:p>
     <w:p>
       <w:r>
-        <w:t>Significance (Holm-adjusted): AURA is better than all five baselines on regret (d_z: −0.71 vs static, −0.62 correlational, −0.52 population, −0.43 expert, −0.28 heuristic), distress events (all five) and accuracy and completion (all five). On 7-day retention and on reaching mastery it is significantly better than four of five (not heuristic: p = 0.24 and 0.07). On learning gain it is significantly better than four of five (heuristic p = 0.056).</w:t>
+        <w:t>Significance (paired, Holm-adjusted):</w:t>
+      </w:r>
+    </w:p>
+    <w:p>
+      <w:pPr>
+        <w:pStyle w:val="ListBullet"/>
+      </w:pPr>
+      <w:r>
+        <w:rPr>
+          <w:b/>
+        </w:rPr>
+        <w:t>Regret:</w:t>
+      </w:r>
+      <w:r>
+        <w:t xml:space="preserve"> AURA is significantly better than all five baselines (d_z −0.72 vs static, −0.64 correlational, −0.56 population, −0.48 expert, −0.37 heuristic; all Holm p ≤ 0.0014).</w:t>
+      </w:r>
+    </w:p>
+    <w:p>
+      <w:pPr>
+        <w:pStyle w:val="ListBullet"/>
+      </w:pPr>
+      <w:r>
+        <w:rPr>
+          <w:b/>
+        </w:rPr>
+        <w:t>Accuracy and completion:</w:t>
+      </w:r>
+      <w:r>
+        <w:t xml:space="preserve"> significantly better than all five.</w:t>
+      </w:r>
+    </w:p>
+    <w:p>
+      <w:pPr>
+        <w:pStyle w:val="ListBullet"/>
+      </w:pPr>
+      <w:r>
+        <w:rPr>
+          <w:b/>
+        </w:rPr>
+        <w:t>Distress events, learning gain, reaching mastery:</w:t>
+      </w:r>
+      <w:r>
+        <w:t xml:space="preserve"> significantly better than four of five; not significantly different from the heuristic baseline (p = 0.088, 0.34, 0.125).</w:t>
+      </w:r>
+    </w:p>
+    <w:p>
+      <w:pPr>
+        <w:pStyle w:val="ListBullet"/>
+      </w:pPr>
+      <w:r>
+        <w:rPr>
+          <w:b/>
+        </w:rPr>
+        <w:t>7-day retention:</w:t>
+      </w:r>
+      <w:r>
+        <w:t xml:space="preserve"> significantly higher than static (+15.3 pp) and correlational (+11.2 pp) only. Not significant against population-level (p = 0.086) or expert (p = 0.076), and AURA is 1.5 pp </w:t>
+      </w:r>
+      <w:r>
+        <w:rPr>
+          <w:i/>
+        </w:rPr>
+        <w:t>below</w:t>
+      </w:r>
+      <w:r>
+        <w:t xml:space="preserve"> the heuristic baseline (p = 0.54). We therefore do not claim a retention advantage over the stronger baselines.</w:t>
+      </w:r>
+    </w:p>
+    <w:p>
+      <w:pPr>
+        <w:pStyle w:val="ListBullet"/>
+      </w:pPr>
+      <w:r>
+        <w:rPr>
+          <w:b/>
+        </w:rPr>
+        <w:t>Reaching and keeping the child's true best decision:</w:t>
+      </w:r>
+      <w:r>
+        <w:t xml:space="preserve"> AURA 24% vs 1% (static) and 6% (each other baseline), significantly better than all five.</w:t>
+      </w:r>
+    </w:p>
+    <w:p>
+      <w:r>
+        <w:rPr>
+          <w:i/>
+        </w:rPr>
+        <w:t>Note on an earlier draft.</w:t>
+      </w:r>
+      <w:r>
+        <w:t xml:space="preserve"> These figures supersede a first run made before a sampling fix in the engine (the population prior had been counted twice). The fix lowered regret (8.30 → 7.13) and raised personalization accuracy (below), but lowered 7-day retention (91.1% → 87.0%), which is why the retention claim above is narrower than in the draft.</w:t>
       </w:r>
     </w:p>
     <w:p>
@@ -3685,7 +3861,7 @@
         <w:pStyle w:val="ListBullet"/>
       </w:pPr>
       <w:r>
-        <w:t>Across 80 children, accuracy rose from 84.7% (first 10 activities) to 94.2% (last 10) and mean mastery from 0.64 after the first activity to 0.90.</w:t>
+        <w:t>Across 80 children, accuracy rose from 86.7% (first 10 activities) to 94.6% (last 10) under AURA (learning gain +7.9 pp, against −0.1 pp for the static system) and final mastery reached 0.91 (static 0.78).</w:t>
       </w:r>
     </w:p>
     <w:p>
@@ -3840,7 +4016,7 @@
               <w:rPr>
                 <w:sz w:val="18"/>
               </w:rPr>
-              <w:t>0.8%</w:t>
+              <w:t>1.3%</w:t>
             </w:r>
           </w:p>
         </w:tc>
@@ -3857,7 +4033,7 @@
               <w:rPr>
                 <w:sz w:val="18"/>
               </w:rPr>
-              <w:t>0.0%</w:t>
+              <w:t>1.0%</w:t>
             </w:r>
           </w:p>
         </w:tc>
@@ -3910,7 +4086,7 @@
               <w:rPr>
                 <w:sz w:val="18"/>
               </w:rPr>
-              <w:t>17.6%</w:t>
+              <w:t>14.9%</w:t>
             </w:r>
           </w:p>
         </w:tc>
@@ -3927,7 +4103,7 @@
               <w:rPr>
                 <w:sz w:val="18"/>
               </w:rPr>
-              <w:t>12.5%</w:t>
+              <w:t>12.1%</w:t>
             </w:r>
           </w:p>
         </w:tc>
@@ -3944,7 +4120,7 @@
               <w:rPr>
                 <w:sz w:val="18"/>
               </w:rPr>
-              <w:t>0.0%</w:t>
+              <w:t>1.5%</w:t>
             </w:r>
           </w:p>
         </w:tc>
@@ -3980,7 +4156,7 @@
               <w:rPr>
                 <w:sz w:val="18"/>
               </w:rPr>
-              <w:t>34.9%</w:t>
+              <w:t>30.2%</w:t>
             </w:r>
           </w:p>
         </w:tc>
@@ -3997,7 +4173,7 @@
               <w:rPr>
                 <w:sz w:val="18"/>
               </w:rPr>
-              <w:t>29.1%</w:t>
+              <w:t>28.7%</w:t>
             </w:r>
           </w:p>
         </w:tc>
@@ -4014,7 +4190,7 @@
               <w:rPr>
                 <w:sz w:val="18"/>
               </w:rPr>
-              <w:t>4.8%</w:t>
+              <w:t>6.8%</w:t>
             </w:r>
           </w:p>
         </w:tc>
@@ -4050,7 +4226,7 @@
               <w:rPr>
                 <w:sz w:val="18"/>
               </w:rPr>
-              <w:t>53.7%</w:t>
+              <w:t>49.6%</w:t>
             </w:r>
           </w:p>
         </w:tc>
@@ -4067,7 +4243,7 @@
               <w:rPr>
                 <w:sz w:val="18"/>
               </w:rPr>
-              <w:t>35.5%</w:t>
+              <w:t>42.1%</w:t>
             </w:r>
           </w:p>
         </w:tc>
@@ -4084,7 +4260,7 @@
               <w:rPr>
                 <w:sz w:val="18"/>
               </w:rPr>
-              <w:t>9.3%</w:t>
+              <w:t>15.5%</w:t>
             </w:r>
           </w:p>
         </w:tc>
@@ -4111,7 +4287,16 @@
         <w:t>Difficulty.</w:t>
       </w:r>
       <w:r>
-        <w:t xml:space="preserve"> The rule-based difficulty model steps with performance (§5.1) but was not part of these studies; all 3,165 traced lessons ran at level 1 because it had not yet been wired in. A fixed-versus-adaptive difficulty comparison therefore requires adding difficulty to the simulator and re-running; it is listed as future work, not as a result.</w:t>
+        <w:t xml:space="preserve"> The difficulty rule (§5.1) is active in these runs: lessons were served at level 1 (224), level 2 (186) and level 3 (2,761). It reaches level 3 for most lessons because the simulated child's accuracy and speed do not depend on the level. The simulator has no difficulty model, so the effect of adaptive difficulty on learning is </w:t>
+      </w:r>
+      <w:r>
+        <w:rPr>
+          <w:i/>
+        </w:rPr>
+        <w:t>not</w:t>
+      </w:r>
+      <w:r>
+        <w:t xml:space="preserve"> measured here, and a fixed-versus-adaptive difficulty comparison is left to the pilot (where response time and the share of activities in a 70–90% accuracy band can be measured on real children).</w:t>
       </w:r>
     </w:p>
     <w:p>
@@ -4124,7 +4309,7 @@
     </w:p>
     <w:p>
       <w:r>
-        <w:t>Share of activities using the child's true best arm, first vs last block of five:</w:t>
+        <w:t>Share of activities using the child's true best arm, first vs last ten activities:</w:t>
       </w:r>
     </w:p>
     <w:tbl>
@@ -4207,7 +4392,7 @@
                 <w:b/>
                 <w:sz w:val="18"/>
               </w:rPr>
-              <w:t>Blocks 1–5</w:t>
+              <w:t>First 10</w:t>
             </w:r>
           </w:p>
         </w:tc>
@@ -4230,7 +4415,7 @@
                 <w:b/>
                 <w:sz w:val="18"/>
               </w:rPr>
-              <w:t>Blocks 36–40</w:t>
+              <w:t>Last 10</w:t>
             </w:r>
           </w:p>
         </w:tc>
@@ -4306,7 +4491,7 @@
               <w:rPr>
                 <w:sz w:val="18"/>
               </w:rPr>
-              <w:t>55.9%</w:t>
+              <w:t>69.2%</w:t>
             </w:r>
           </w:p>
         </w:tc>
@@ -4323,7 +4508,7 @@
               <w:rPr>
                 <w:sz w:val="18"/>
               </w:rPr>
-              <w:t>85.9%</w:t>
+              <w:t>87.9%</w:t>
             </w:r>
           </w:p>
         </w:tc>
@@ -4340,7 +4525,7 @@
               <w:rPr>
                 <w:sz w:val="18"/>
               </w:rPr>
-              <w:t>86.2% (69/80)</w:t>
+              <w:t>88.8% (71/80)</w:t>
             </w:r>
           </w:p>
         </w:tc>
@@ -4393,7 +4578,7 @@
               <w:rPr>
                 <w:sz w:val="18"/>
               </w:rPr>
-              <w:t>50.8%</w:t>
+              <w:t>60.4%</w:t>
             </w:r>
           </w:p>
         </w:tc>
@@ -4410,7 +4595,7 @@
               <w:rPr>
                 <w:sz w:val="18"/>
               </w:rPr>
-              <w:t>78.6%</w:t>
+              <w:t>79.5%</w:t>
             </w:r>
           </w:p>
         </w:tc>
@@ -4480,7 +4665,7 @@
               <w:rPr>
                 <w:sz w:val="18"/>
               </w:rPr>
-              <w:t>24.0%</w:t>
+              <w:t>28.5%</w:t>
             </w:r>
           </w:p>
         </w:tc>
@@ -4497,7 +4682,7 @@
               <w:rPr>
                 <w:sz w:val="18"/>
               </w:rPr>
-              <w:t>37.5%</w:t>
+              <w:t>39.8%</w:t>
             </w:r>
           </w:p>
         </w:tc>
@@ -4514,7 +4699,7 @@
               <w:rPr>
                 <w:sz w:val="18"/>
               </w:rPr>
-              <w:t>38.8% (31/80)</w:t>
+              <w:t>42.5% (34/80)</w:t>
             </w:r>
           </w:p>
         </w:tc>
@@ -4543,7 +4728,7 @@
         <w:pStyle w:val="ListBullet"/>
       </w:pPr>
       <w:r>
-        <w:t>Mean simulated distress over all lessons: 0.037 (AURA) vs 0.187 (static); distress events per child 0.44 vs 3.21.</w:t>
+        <w:t>Mean simulated distress over all lessons: 0.033 (AURA) vs 0.187 (static); distress events per child 0.51 vs 3.21 (significantly lower than four of five baselines; heuristic p = 0.088).</w:t>
       </w:r>
     </w:p>
     <w:p>
@@ -4551,7 +4736,7 @@
         <w:pStyle w:val="ListBullet"/>
       </w:pPr>
       <w:r>
-        <w:t>35 of 3,200 traced activities (1.1%) were interventions. Of nine episodes that started above the distress threshold, seven recovered (78%). Recovery in the main studies: 67% (n = 6 children with episodes) and 97% (n = 8, ablation).</w:t>
+        <w:t>29 of 3,200 traced activities (0.9%) were interventions. Of six episodes that started above the distress threshold, four recovered (67%). Recovery in the other studies: 67% (n = 6 children with episodes, main study) and 100% (n = 4, ablation); these denominators are small.</w:t>
       </w:r>
     </w:p>
     <w:tbl>
@@ -4668,7 +4853,7 @@
               <w:rPr>
                 <w:sz w:val="18"/>
               </w:rPr>
-              <w:t>11</w:t>
+              <w:t>6</w:t>
             </w:r>
           </w:p>
         </w:tc>
@@ -4685,7 +4870,7 @@
               <w:rPr>
                 <w:sz w:val="18"/>
               </w:rPr>
-              <w:t>0.59 → 0.32</w:t>
+              <w:t>0.39 → 0.24</w:t>
             </w:r>
           </w:p>
         </w:tc>
@@ -4721,7 +4906,7 @@
               <w:rPr>
                 <w:sz w:val="18"/>
               </w:rPr>
-              <w:t>7</w:t>
+              <w:t>4</w:t>
             </w:r>
           </w:p>
         </w:tc>
@@ -4738,7 +4923,7 @@
               <w:rPr>
                 <w:sz w:val="18"/>
               </w:rPr>
-              <w:t>0.53 → 0.37</w:t>
+              <w:t>0.37 → 0.22</w:t>
             </w:r>
           </w:p>
         </w:tc>
@@ -4774,7 +4959,7 @@
               <w:rPr>
                 <w:sz w:val="18"/>
               </w:rPr>
-              <w:t>10</w:t>
+              <w:t>12</w:t>
             </w:r>
           </w:p>
         </w:tc>
@@ -4791,7 +4976,7 @@
               <w:rPr>
                 <w:sz w:val="18"/>
               </w:rPr>
-              <w:t>0.31 → 0.20</w:t>
+              <w:t>0.33 → 0.22</w:t>
             </w:r>
           </w:p>
         </w:tc>
@@ -4844,7 +5029,7 @@
               <w:rPr>
                 <w:sz w:val="18"/>
               </w:rPr>
-              <w:t>0.35 → 0.23</w:t>
+              <w:t>0.47 → 0.36</w:t>
             </w:r>
           </w:p>
         </w:tc>
@@ -4857,7 +5042,7 @@
     </w:p>
     <w:p>
       <w:r>
-        <w:t>Two honest findings: with about 0.44 interventions per child the engine cannot gather enough trials to personalize them (the best arm was chosen 11 of 35 times, 31% against 25% chance); and the distress safety layer never triggered in simulation (its ablation was identical to full AURA), so its benefit is untested.</w:t>
+        <w:t>Two honest findings: with about 0.4 interventions per child the engine cannot gather enough trials to personalize them (the child's best intervention was chosen 5 of 29 times, 17%, no better than the 25% expected by chance); and the distress safety layer never triggered in simulation (its ablation was identical to full AURA), so its benefit is untested.</w:t>
       </w:r>
     </w:p>
     <w:p>
@@ -4987,7 +5172,7 @@
               <w:rPr>
                 <w:sz w:val="18"/>
               </w:rPr>
-              <w:t>8.74</w:t>
+              <w:t>7.80</w:t>
             </w:r>
           </w:p>
         </w:tc>
@@ -5040,7 +5225,7 @@
               <w:rPr>
                 <w:sz w:val="18"/>
               </w:rPr>
-              <w:t>32.06</w:t>
+              <w:t>31.35</w:t>
             </w:r>
           </w:p>
         </w:tc>
@@ -5057,7 +5242,7 @@
               <w:rPr>
                 <w:sz w:val="18"/>
               </w:rPr>
-              <w:t>yes (d_z = −1.51)</w:t>
+              <w:t>yes (d_z = −1.32)</w:t>
             </w:r>
           </w:p>
         </w:tc>
@@ -5110,7 +5295,7 @@
               <w:rPr>
                 <w:sz w:val="18"/>
               </w:rPr>
-              <w:t>yes (d_z = −0.55, p = 0.0008)</w:t>
+              <w:t>yes (d_z = −0.57, Holm p = 0.0005)</w:t>
             </w:r>
           </w:p>
         </w:tc>
@@ -5146,7 +5331,7 @@
               <w:rPr>
                 <w:sz w:val="18"/>
               </w:rPr>
-              <w:t>8.44</w:t>
+              <w:t>9.18</w:t>
             </w:r>
           </w:p>
         </w:tc>
@@ -5163,7 +5348,7 @@
               <w:rPr>
                 <w:sz w:val="18"/>
               </w:rPr>
-              <w:t>no (p = 0.79)</w:t>
+              <w:t>no (p = 0.34)</w:t>
             </w:r>
           </w:p>
         </w:tc>
@@ -5199,7 +5384,7 @@
               <w:rPr>
                 <w:sz w:val="18"/>
               </w:rPr>
-              <w:t>8.74</w:t>
+              <w:t>7.80</w:t>
             </w:r>
           </w:p>
         </w:tc>
@@ -5341,7 +5526,7 @@
               <w:rPr>
                 <w:sz w:val="18"/>
               </w:rPr>
-              <w:t>not run</w:t>
+              <w:t>not measured (simulator has no difficulty model, §6.4)</w:t>
             </w:r>
           </w:p>
         </w:tc>
@@ -5358,7 +5543,7 @@
               <w:rPr>
                 <w:sz w:val="18"/>
               </w:rPr>
-              <w:t>needs difficulty in the simulator</w:t>
+              <w:t>measure in the pilot</w:t>
             </w:r>
           </w:p>
         </w:tc>
@@ -5394,7 +5579,7 @@
               <w:rPr>
                 <w:sz w:val="18"/>
               </w:rPr>
-              <w:t>pinning theme to "dino": regret 8.30 → 9.44, retention 91.1 → 87.9, not significant</w:t>
+              <w:t>pinning theme to "dino": regret 7.13 → 9.30 (Holm p = 0.071), 7-day retention 87.0 → 85.0; not significant</w:t>
             </w:r>
           </w:p>
         </w:tc>
@@ -5447,7 +5632,7 @@
               <w:rPr>
                 <w:sz w:val="18"/>
               </w:rPr>
-              <w:t>pinning mode to "tap": regret 8.30 → 11.03 (Holm p = 0.095), 7-day retention 91.1 → 83.7 (d_z = −0.28, Holm p = 0.031)</w:t>
+              <w:t>pinning mode to "tap": regret 7.13 → 10.83 (+3.70, d_z 0.27, Holm p = 0.033, significant); retention (87.6 vs 87.0) and distress events (0.79 vs 0.51, p = 0.45) not significantly different</w:t>
             </w:r>
           </w:p>
         </w:tc>
@@ -5531,6 +5716,1234 @@
     <w:p>
       <w:r>
         <w:t>Replay: on the published single-case study [6] (23 sessions), AURA's stopping rule matched the authors' verdict at session 18, five sessions (22%) earlier.</w:t>
+      </w:r>
+    </w:p>
+    <w:p>
+      <w:pPr>
+        <w:pStyle w:val="Heading3"/>
+      </w:pPr>
+      <w:r>
+        <w:t>6.8 Robustness to how the simulated children are built</w:t>
+      </w:r>
+    </w:p>
+    <w:p>
+      <w:r>
+        <w:t xml:space="preserve">Does AURA's advantage depend on our choice of simulated children? We re-ran the comparison (40 children per scenario, 40 activities, seed 44, paired) with preference strengths halved and doubled, distress doubled, five named synthetic archetypes, and a mixed population of them. The archetypes are illustrative parameter settings written by us from commonly described patterns; they are </w:t>
+      </w:r>
+      <w:r>
+        <w:rPr>
+          <w:i/>
+        </w:rPr>
+        <w:t>not</w:t>
+      </w:r>
+      <w:r>
+        <w:t xml:space="preserve"> derived from data on real children and are not evidence about real autistic children. They only show the result does not hinge on one kind of simulated child.</w:t>
+      </w:r>
+    </w:p>
+    <w:tbl>
+      <w:tblPr>
+        <w:tblStyle w:val="TableGrid"/>
+        <w:tblW w:type="auto" w:w="0"/>
+        <w:jc w:val="center"/>
+        <w:tblLook w:firstColumn="1" w:firstRow="1" w:lastColumn="0" w:lastRow="0" w:noHBand="0" w:noVBand="1" w:val="04A0"/>
+      </w:tblPr>
+      <w:tblGrid>
+        <w:gridCol w:w="1624"/>
+        <w:gridCol w:w="1624"/>
+        <w:gridCol w:w="1624"/>
+        <w:gridCol w:w="1624"/>
+        <w:gridCol w:w="1624"/>
+        <w:gridCol w:w="1624"/>
+      </w:tblGrid>
+      <w:tr>
+        <w:tc>
+          <w:tcPr>
+            <w:tcW w:type="dxa" w:w="1624"/>
+            <w:shd w:val="clear" w:color="auto" w:fill="E4E9F2"/>
+          </w:tcPr>
+          <w:p>
+            <w:pPr>
+              <w:spacing w:after="20"/>
+            </w:pPr>
+            <w:r>
+              <w:rPr>
+                <w:b/>
+              </w:rPr>
+            </w:r>
+            <w:r>
+              <w:rPr>
+                <w:b/>
+                <w:sz w:val="18"/>
+              </w:rPr>
+              <w:t>Scenario</w:t>
+            </w:r>
+          </w:p>
+        </w:tc>
+        <w:tc>
+          <w:tcPr>
+            <w:tcW w:type="dxa" w:w="1624"/>
+            <w:shd w:val="clear" w:color="auto" w:fill="E4E9F2"/>
+          </w:tcPr>
+          <w:p>
+            <w:pPr>
+              <w:spacing w:after="20"/>
+            </w:pPr>
+            <w:r>
+              <w:rPr>
+                <w:b/>
+              </w:rPr>
+            </w:r>
+            <w:r>
+              <w:rPr>
+                <w:b/>
+                <w:sz w:val="18"/>
+              </w:rPr>
+              <w:t>AURA regret</w:t>
+            </w:r>
+          </w:p>
+        </w:tc>
+        <w:tc>
+          <w:tcPr>
+            <w:tcW w:type="dxa" w:w="1624"/>
+            <w:shd w:val="clear" w:color="auto" w:fill="E4E9F2"/>
+          </w:tcPr>
+          <w:p>
+            <w:pPr>
+              <w:spacing w:after="20"/>
+            </w:pPr>
+            <w:r>
+              <w:rPr>
+                <w:b/>
+              </w:rPr>
+            </w:r>
+            <w:r>
+              <w:rPr>
+                <w:b/>
+                <w:sz w:val="18"/>
+              </w:rPr>
+              <w:t>Static (p)</w:t>
+            </w:r>
+          </w:p>
+        </w:tc>
+        <w:tc>
+          <w:tcPr>
+            <w:tcW w:type="dxa" w:w="1624"/>
+            <w:shd w:val="clear" w:color="auto" w:fill="E4E9F2"/>
+          </w:tcPr>
+          <w:p>
+            <w:pPr>
+              <w:spacing w:after="20"/>
+            </w:pPr>
+            <w:r>
+              <w:rPr>
+                <w:b/>
+              </w:rPr>
+            </w:r>
+            <w:r>
+              <w:rPr>
+                <w:b/>
+                <w:sz w:val="18"/>
+              </w:rPr>
+              <w:t>Heuristic (p)</w:t>
+            </w:r>
+          </w:p>
+        </w:tc>
+        <w:tc>
+          <w:tcPr>
+            <w:tcW w:type="dxa" w:w="1624"/>
+            <w:shd w:val="clear" w:color="auto" w:fill="E4E9F2"/>
+          </w:tcPr>
+          <w:p>
+            <w:pPr>
+              <w:spacing w:after="20"/>
+            </w:pPr>
+            <w:r>
+              <w:rPr>
+                <w:b/>
+              </w:rPr>
+            </w:r>
+            <w:r>
+              <w:rPr>
+                <w:b/>
+                <w:sz w:val="18"/>
+              </w:rPr>
+              <w:t>AURA retention %</w:t>
+            </w:r>
+          </w:p>
+        </w:tc>
+        <w:tc>
+          <w:tcPr>
+            <w:tcW w:type="dxa" w:w="1624"/>
+            <w:shd w:val="clear" w:color="auto" w:fill="E4E9F2"/>
+          </w:tcPr>
+          <w:p>
+            <w:pPr>
+              <w:spacing w:after="20"/>
+            </w:pPr>
+            <w:r>
+              <w:rPr>
+                <w:b/>
+              </w:rPr>
+            </w:r>
+            <w:r>
+              <w:rPr>
+                <w:b/>
+                <w:sz w:val="18"/>
+              </w:rPr>
+              <w:t>Heuristic retention %</w:t>
+            </w:r>
+          </w:p>
+        </w:tc>
+      </w:tr>
+      <w:tr>
+        <w:tc>
+          <w:tcPr>
+            <w:tcW w:type="dxa" w:w="1624"/>
+          </w:tcPr>
+          <w:p>
+            <w:pPr>
+              <w:spacing w:after="20"/>
+            </w:pPr>
+            <w:r/>
+            <w:r>
+              <w:rPr>
+                <w:sz w:val="18"/>
+              </w:rPr>
+              <w:t>Weak preferences (×0.5)</w:t>
+            </w:r>
+          </w:p>
+        </w:tc>
+        <w:tc>
+          <w:tcPr>
+            <w:tcW w:type="dxa" w:w="1624"/>
+          </w:tcPr>
+          <w:p>
+            <w:pPr>
+              <w:spacing w:after="20"/>
+            </w:pPr>
+            <w:r/>
+            <w:r>
+              <w:rPr>
+                <w:sz w:val="18"/>
+              </w:rPr>
+              <w:t>13.12</w:t>
+            </w:r>
+          </w:p>
+        </w:tc>
+        <w:tc>
+          <w:tcPr>
+            <w:tcW w:type="dxa" w:w="1624"/>
+          </w:tcPr>
+          <w:p>
+            <w:pPr>
+              <w:spacing w:after="20"/>
+            </w:pPr>
+            <w:r/>
+            <w:r>
+              <w:rPr>
+                <w:sz w:val="18"/>
+              </w:rPr>
+              <w:t>19.19 (0.003)</w:t>
+            </w:r>
+          </w:p>
+        </w:tc>
+        <w:tc>
+          <w:tcPr>
+            <w:tcW w:type="dxa" w:w="1624"/>
+          </w:tcPr>
+          <w:p>
+            <w:pPr>
+              <w:spacing w:after="20"/>
+            </w:pPr>
+            <w:r/>
+            <w:r>
+              <w:rPr>
+                <w:sz w:val="18"/>
+              </w:rPr>
+              <w:t>15.13 (0.17)</w:t>
+            </w:r>
+          </w:p>
+        </w:tc>
+        <w:tc>
+          <w:tcPr>
+            <w:tcW w:type="dxa" w:w="1624"/>
+          </w:tcPr>
+          <w:p>
+            <w:pPr>
+              <w:spacing w:after="20"/>
+            </w:pPr>
+            <w:r/>
+            <w:r>
+              <w:rPr>
+                <w:sz w:val="18"/>
+              </w:rPr>
+              <w:t>60.9</w:t>
+            </w:r>
+          </w:p>
+        </w:tc>
+        <w:tc>
+          <w:tcPr>
+            <w:tcW w:type="dxa" w:w="1624"/>
+          </w:tcPr>
+          <w:p>
+            <w:pPr>
+              <w:spacing w:after="20"/>
+            </w:pPr>
+            <w:r/>
+            <w:r>
+              <w:rPr>
+                <w:sz w:val="18"/>
+              </w:rPr>
+              <w:t>52.2</w:t>
+            </w:r>
+          </w:p>
+        </w:tc>
+      </w:tr>
+      <w:tr>
+        <w:tc>
+          <w:tcPr>
+            <w:tcW w:type="dxa" w:w="1624"/>
+          </w:tcPr>
+          <w:p>
+            <w:pPr>
+              <w:spacing w:after="20"/>
+            </w:pPr>
+            <w:r/>
+            <w:r>
+              <w:rPr>
+                <w:sz w:val="18"/>
+              </w:rPr>
+              <w:t>As in main study</w:t>
+            </w:r>
+          </w:p>
+        </w:tc>
+        <w:tc>
+          <w:tcPr>
+            <w:tcW w:type="dxa" w:w="1624"/>
+          </w:tcPr>
+          <w:p>
+            <w:pPr>
+              <w:spacing w:after="20"/>
+            </w:pPr>
+            <w:r/>
+            <w:r>
+              <w:rPr>
+                <w:sz w:val="18"/>
+              </w:rPr>
+              <w:t>11.50</w:t>
+            </w:r>
+          </w:p>
+        </w:tc>
+        <w:tc>
+          <w:tcPr>
+            <w:tcW w:type="dxa" w:w="1624"/>
+          </w:tcPr>
+          <w:p>
+            <w:pPr>
+              <w:spacing w:after="20"/>
+            </w:pPr>
+            <w:r/>
+            <w:r>
+              <w:rPr>
+                <w:sz w:val="18"/>
+              </w:rPr>
+              <w:t>28.39 (&lt;0.001)</w:t>
+            </w:r>
+          </w:p>
+        </w:tc>
+        <w:tc>
+          <w:tcPr>
+            <w:tcW w:type="dxa" w:w="1624"/>
+          </w:tcPr>
+          <w:p>
+            <w:pPr>
+              <w:spacing w:after="20"/>
+            </w:pPr>
+            <w:r/>
+            <w:r>
+              <w:rPr>
+                <w:sz w:val="18"/>
+              </w:rPr>
+              <w:t>14.48 (0.033)</w:t>
+            </w:r>
+          </w:p>
+        </w:tc>
+        <w:tc>
+          <w:tcPr>
+            <w:tcW w:type="dxa" w:w="1624"/>
+          </w:tcPr>
+          <w:p>
+            <w:pPr>
+              <w:spacing w:after="20"/>
+            </w:pPr>
+            <w:r/>
+            <w:r>
+              <w:rPr>
+                <w:sz w:val="18"/>
+              </w:rPr>
+              <w:t>84.9</w:t>
+            </w:r>
+          </w:p>
+        </w:tc>
+        <w:tc>
+          <w:tcPr>
+            <w:tcW w:type="dxa" w:w="1624"/>
+          </w:tcPr>
+          <w:p>
+            <w:pPr>
+              <w:spacing w:after="20"/>
+            </w:pPr>
+            <w:r/>
+            <w:r>
+              <w:rPr>
+                <w:sz w:val="18"/>
+              </w:rPr>
+              <w:t>83.6</w:t>
+            </w:r>
+          </w:p>
+        </w:tc>
+      </w:tr>
+      <w:tr>
+        <w:tc>
+          <w:tcPr>
+            <w:tcW w:type="dxa" w:w="1624"/>
+          </w:tcPr>
+          <w:p>
+            <w:pPr>
+              <w:spacing w:after="20"/>
+            </w:pPr>
+            <w:r/>
+            <w:r>
+              <w:rPr>
+                <w:sz w:val="18"/>
+              </w:rPr>
+              <w:t>Strong preferences (×2)</w:t>
+            </w:r>
+          </w:p>
+        </w:tc>
+        <w:tc>
+          <w:tcPr>
+            <w:tcW w:type="dxa" w:w="1624"/>
+          </w:tcPr>
+          <w:p>
+            <w:pPr>
+              <w:spacing w:after="20"/>
+            </w:pPr>
+            <w:r/>
+            <w:r>
+              <w:rPr>
+                <w:sz w:val="18"/>
+              </w:rPr>
+              <w:t>3.47</w:t>
+            </w:r>
+          </w:p>
+        </w:tc>
+        <w:tc>
+          <w:tcPr>
+            <w:tcW w:type="dxa" w:w="1624"/>
+          </w:tcPr>
+          <w:p>
+            <w:pPr>
+              <w:spacing w:after="20"/>
+            </w:pPr>
+            <w:r/>
+            <w:r>
+              <w:rPr>
+                <w:sz w:val="18"/>
+              </w:rPr>
+              <w:t>21.89 (0.032)</w:t>
+            </w:r>
+          </w:p>
+        </w:tc>
+        <w:tc>
+          <w:tcPr>
+            <w:tcW w:type="dxa" w:w="1624"/>
+          </w:tcPr>
+          <w:p>
+            <w:pPr>
+              <w:spacing w:after="20"/>
+            </w:pPr>
+            <w:r/>
+            <w:r>
+              <w:rPr>
+                <w:sz w:val="18"/>
+              </w:rPr>
+              <w:t>6.35 (0.24)</w:t>
+            </w:r>
+          </w:p>
+        </w:tc>
+        <w:tc>
+          <w:tcPr>
+            <w:tcW w:type="dxa" w:w="1624"/>
+          </w:tcPr>
+          <w:p>
+            <w:pPr>
+              <w:spacing w:after="20"/>
+            </w:pPr>
+            <w:r/>
+            <w:r>
+              <w:rPr>
+                <w:sz w:val="18"/>
+              </w:rPr>
+              <w:t>91.3</w:t>
+            </w:r>
+          </w:p>
+        </w:tc>
+        <w:tc>
+          <w:tcPr>
+            <w:tcW w:type="dxa" w:w="1624"/>
+          </w:tcPr>
+          <w:p>
+            <w:pPr>
+              <w:spacing w:after="20"/>
+            </w:pPr>
+            <w:r/>
+            <w:r>
+              <w:rPr>
+                <w:sz w:val="18"/>
+              </w:rPr>
+              <w:t>93.0</w:t>
+            </w:r>
+          </w:p>
+        </w:tc>
+      </w:tr>
+      <w:tr>
+        <w:tc>
+          <w:tcPr>
+            <w:tcW w:type="dxa" w:w="1624"/>
+          </w:tcPr>
+          <w:p>
+            <w:pPr>
+              <w:spacing w:after="20"/>
+            </w:pPr>
+            <w:r/>
+            <w:r>
+              <w:rPr>
+                <w:sz w:val="18"/>
+              </w:rPr>
+              <w:t>Distress ×2</w:t>
+            </w:r>
+          </w:p>
+        </w:tc>
+        <w:tc>
+          <w:tcPr>
+            <w:tcW w:type="dxa" w:w="1624"/>
+          </w:tcPr>
+          <w:p>
+            <w:pPr>
+              <w:spacing w:after="20"/>
+            </w:pPr>
+            <w:r/>
+            <w:r>
+              <w:rPr>
+                <w:sz w:val="18"/>
+              </w:rPr>
+              <w:t>11.17</w:t>
+            </w:r>
+          </w:p>
+        </w:tc>
+        <w:tc>
+          <w:tcPr>
+            <w:tcW w:type="dxa" w:w="1624"/>
+          </w:tcPr>
+          <w:p>
+            <w:pPr>
+              <w:spacing w:after="20"/>
+            </w:pPr>
+            <w:r/>
+            <w:r>
+              <w:rPr>
+                <w:sz w:val="18"/>
+              </w:rPr>
+              <w:t>27.83 (&lt;0.001)</w:t>
+            </w:r>
+          </w:p>
+        </w:tc>
+        <w:tc>
+          <w:tcPr>
+            <w:tcW w:type="dxa" w:w="1624"/>
+          </w:tcPr>
+          <w:p>
+            <w:pPr>
+              <w:spacing w:after="20"/>
+            </w:pPr>
+            <w:r/>
+            <w:r>
+              <w:rPr>
+                <w:sz w:val="18"/>
+              </w:rPr>
+              <w:t>14.84 (0.023)</w:t>
+            </w:r>
+          </w:p>
+        </w:tc>
+        <w:tc>
+          <w:tcPr>
+            <w:tcW w:type="dxa" w:w="1624"/>
+          </w:tcPr>
+          <w:p>
+            <w:pPr>
+              <w:spacing w:after="20"/>
+            </w:pPr>
+            <w:r/>
+            <w:r>
+              <w:rPr>
+                <w:sz w:val="18"/>
+              </w:rPr>
+              <w:t>81.2</w:t>
+            </w:r>
+          </w:p>
+        </w:tc>
+        <w:tc>
+          <w:tcPr>
+            <w:tcW w:type="dxa" w:w="1624"/>
+          </w:tcPr>
+          <w:p>
+            <w:pPr>
+              <w:spacing w:after="20"/>
+            </w:pPr>
+            <w:r/>
+            <w:r>
+              <w:rPr>
+                <w:sz w:val="18"/>
+              </w:rPr>
+              <w:t>79.9</w:t>
+            </w:r>
+          </w:p>
+        </w:tc>
+      </w:tr>
+      <w:tr>
+        <w:tc>
+          <w:tcPr>
+            <w:tcW w:type="dxa" w:w="1624"/>
+          </w:tcPr>
+          <w:p>
+            <w:pPr>
+              <w:spacing w:after="20"/>
+            </w:pPr>
+            <w:r/>
+            <w:r>
+              <w:rPr>
+                <w:sz w:val="18"/>
+              </w:rPr>
+              <w:t>Finds mistakes upsetting</w:t>
+            </w:r>
+          </w:p>
+        </w:tc>
+        <w:tc>
+          <w:tcPr>
+            <w:tcW w:type="dxa" w:w="1624"/>
+          </w:tcPr>
+          <w:p>
+            <w:pPr>
+              <w:spacing w:after="20"/>
+            </w:pPr>
+            <w:r/>
+            <w:r>
+              <w:rPr>
+                <w:sz w:val="18"/>
+              </w:rPr>
+              <w:t>12.52</w:t>
+            </w:r>
+          </w:p>
+        </w:tc>
+        <w:tc>
+          <w:tcPr>
+            <w:tcW w:type="dxa" w:w="1624"/>
+          </w:tcPr>
+          <w:p>
+            <w:pPr>
+              <w:spacing w:after="20"/>
+            </w:pPr>
+            <w:r/>
+            <w:r>
+              <w:rPr>
+                <w:sz w:val="18"/>
+              </w:rPr>
+              <w:t>30.53 (&lt;0.001)</w:t>
+            </w:r>
+          </w:p>
+        </w:tc>
+        <w:tc>
+          <w:tcPr>
+            <w:tcW w:type="dxa" w:w="1624"/>
+          </w:tcPr>
+          <w:p>
+            <w:pPr>
+              <w:spacing w:after="20"/>
+            </w:pPr>
+            <w:r/>
+            <w:r>
+              <w:rPr>
+                <w:sz w:val="18"/>
+              </w:rPr>
+              <w:t>18.69 (0.016)</w:t>
+            </w:r>
+          </w:p>
+        </w:tc>
+        <w:tc>
+          <w:tcPr>
+            <w:tcW w:type="dxa" w:w="1624"/>
+          </w:tcPr>
+          <w:p>
+            <w:pPr>
+              <w:spacing w:after="20"/>
+            </w:pPr>
+            <w:r/>
+            <w:r>
+              <w:rPr>
+                <w:sz w:val="18"/>
+              </w:rPr>
+              <w:t>77.8</w:t>
+            </w:r>
+          </w:p>
+        </w:tc>
+        <w:tc>
+          <w:tcPr>
+            <w:tcW w:type="dxa" w:w="1624"/>
+          </w:tcPr>
+          <w:p>
+            <w:pPr>
+              <w:spacing w:after="20"/>
+            </w:pPr>
+            <w:r/>
+            <w:r>
+              <w:rPr>
+                <w:sz w:val="18"/>
+              </w:rPr>
+              <w:t>75.4</w:t>
+            </w:r>
+          </w:p>
+        </w:tc>
+      </w:tr>
+      <w:tr>
+        <w:tc>
+          <w:tcPr>
+            <w:tcW w:type="dxa" w:w="1624"/>
+          </w:tcPr>
+          <w:p>
+            <w:pPr>
+              <w:spacing w:after="20"/>
+            </w:pPr>
+            <w:r/>
+            <w:r>
+              <w:rPr>
+                <w:sz w:val="18"/>
+              </w:rPr>
+              <w:t>Slow, steady learner</w:t>
+            </w:r>
+          </w:p>
+        </w:tc>
+        <w:tc>
+          <w:tcPr>
+            <w:tcW w:type="dxa" w:w="1624"/>
+          </w:tcPr>
+          <w:p>
+            <w:pPr>
+              <w:spacing w:after="20"/>
+            </w:pPr>
+            <w:r/>
+            <w:r>
+              <w:rPr>
+                <w:sz w:val="18"/>
+              </w:rPr>
+              <w:t>19.01</w:t>
+            </w:r>
+          </w:p>
+        </w:tc>
+        <w:tc>
+          <w:tcPr>
+            <w:tcW w:type="dxa" w:w="1624"/>
+          </w:tcPr>
+          <w:p>
+            <w:pPr>
+              <w:spacing w:after="20"/>
+            </w:pPr>
+            <w:r/>
+            <w:r>
+              <w:rPr>
+                <w:sz w:val="18"/>
+              </w:rPr>
+              <w:t>35.86 (&lt;0.001)</w:t>
+            </w:r>
+          </w:p>
+        </w:tc>
+        <w:tc>
+          <w:tcPr>
+            <w:tcW w:type="dxa" w:w="1624"/>
+          </w:tcPr>
+          <w:p>
+            <w:pPr>
+              <w:spacing w:after="20"/>
+            </w:pPr>
+            <w:r/>
+            <w:r>
+              <w:rPr>
+                <w:sz w:val="18"/>
+              </w:rPr>
+              <w:t>26.01 (0.005)</w:t>
+            </w:r>
+          </w:p>
+        </w:tc>
+        <w:tc>
+          <w:tcPr>
+            <w:tcW w:type="dxa" w:w="1624"/>
+          </w:tcPr>
+          <w:p>
+            <w:pPr>
+              <w:spacing w:after="20"/>
+            </w:pPr>
+            <w:r/>
+            <w:r>
+              <w:rPr>
+                <w:sz w:val="18"/>
+              </w:rPr>
+              <w:t>66.0</w:t>
+            </w:r>
+          </w:p>
+        </w:tc>
+        <w:tc>
+          <w:tcPr>
+            <w:tcW w:type="dxa" w:w="1624"/>
+          </w:tcPr>
+          <w:p>
+            <w:pPr>
+              <w:spacing w:after="20"/>
+            </w:pPr>
+            <w:r/>
+            <w:r>
+              <w:rPr>
+                <w:sz w:val="18"/>
+              </w:rPr>
+              <w:t>49.3</w:t>
+            </w:r>
+          </w:p>
+        </w:tc>
+      </w:tr>
+      <w:tr>
+        <w:tc>
+          <w:tcPr>
+            <w:tcW w:type="dxa" w:w="1624"/>
+          </w:tcPr>
+          <w:p>
+            <w:pPr>
+              <w:spacing w:after="20"/>
+            </w:pPr>
+            <w:r/>
+            <w:r>
+              <w:rPr>
+                <w:sz w:val="18"/>
+              </w:rPr>
+              <w:t>One strongly preferred way of working</w:t>
+            </w:r>
+          </w:p>
+        </w:tc>
+        <w:tc>
+          <w:tcPr>
+            <w:tcW w:type="dxa" w:w="1624"/>
+          </w:tcPr>
+          <w:p>
+            <w:pPr>
+              <w:spacing w:after="20"/>
+            </w:pPr>
+            <w:r/>
+            <w:r>
+              <w:rPr>
+                <w:sz w:val="18"/>
+              </w:rPr>
+              <w:t>3.95</w:t>
+            </w:r>
+          </w:p>
+        </w:tc>
+        <w:tc>
+          <w:tcPr>
+            <w:tcW w:type="dxa" w:w="1624"/>
+          </w:tcPr>
+          <w:p>
+            <w:pPr>
+              <w:spacing w:after="20"/>
+            </w:pPr>
+            <w:r/>
+            <w:r>
+              <w:rPr>
+                <w:sz w:val="18"/>
+              </w:rPr>
+              <w:t>24.52 (0.025)</w:t>
+            </w:r>
+          </w:p>
+        </w:tc>
+        <w:tc>
+          <w:tcPr>
+            <w:tcW w:type="dxa" w:w="1624"/>
+          </w:tcPr>
+          <w:p>
+            <w:pPr>
+              <w:spacing w:after="20"/>
+            </w:pPr>
+            <w:r/>
+            <w:r>
+              <w:rPr>
+                <w:sz w:val="18"/>
+              </w:rPr>
+              <w:t>6.96 (0.155)</w:t>
+            </w:r>
+          </w:p>
+        </w:tc>
+        <w:tc>
+          <w:tcPr>
+            <w:tcW w:type="dxa" w:w="1624"/>
+          </w:tcPr>
+          <w:p>
+            <w:pPr>
+              <w:spacing w:after="20"/>
+            </w:pPr>
+            <w:r/>
+            <w:r>
+              <w:rPr>
+                <w:sz w:val="18"/>
+              </w:rPr>
+              <w:t>90.9</w:t>
+            </w:r>
+          </w:p>
+        </w:tc>
+        <w:tc>
+          <w:tcPr>
+            <w:tcW w:type="dxa" w:w="1624"/>
+          </w:tcPr>
+          <w:p>
+            <w:pPr>
+              <w:spacing w:after="20"/>
+            </w:pPr>
+            <w:r/>
+            <w:r>
+              <w:rPr>
+                <w:sz w:val="18"/>
+              </w:rPr>
+              <w:t>88.6</w:t>
+            </w:r>
+          </w:p>
+        </w:tc>
+      </w:tr>
+      <w:tr>
+        <w:tc>
+          <w:tcPr>
+            <w:tcW w:type="dxa" w:w="1624"/>
+          </w:tcPr>
+          <w:p>
+            <w:pPr>
+              <w:spacing w:after="20"/>
+            </w:pPr>
+            <w:r/>
+            <w:r>
+              <w:rPr>
+                <w:sz w:val="18"/>
+              </w:rPr>
+              <w:t>No clear preferences</w:t>
+            </w:r>
+          </w:p>
+        </w:tc>
+        <w:tc>
+          <w:tcPr>
+            <w:tcW w:type="dxa" w:w="1624"/>
+          </w:tcPr>
+          <w:p>
+            <w:pPr>
+              <w:spacing w:after="20"/>
+            </w:pPr>
+            <w:r/>
+            <w:r>
+              <w:rPr>
+                <w:sz w:val="18"/>
+              </w:rPr>
+              <w:t>8.05</w:t>
+            </w:r>
+          </w:p>
+        </w:tc>
+        <w:tc>
+          <w:tcPr>
+            <w:tcW w:type="dxa" w:w="1624"/>
+          </w:tcPr>
+          <w:p>
+            <w:pPr>
+              <w:spacing w:after="20"/>
+            </w:pPr>
+            <w:r/>
+            <w:r>
+              <w:rPr>
+                <w:sz w:val="18"/>
+              </w:rPr>
+              <w:t>9.47 (0.17)</w:t>
+            </w:r>
+          </w:p>
+        </w:tc>
+        <w:tc>
+          <w:tcPr>
+            <w:tcW w:type="dxa" w:w="1624"/>
+          </w:tcPr>
+          <w:p>
+            <w:pPr>
+              <w:spacing w:after="20"/>
+            </w:pPr>
+            <w:r/>
+            <w:r>
+              <w:rPr>
+                <w:sz w:val="18"/>
+              </w:rPr>
+              <w:t>8.31 (0.35)</w:t>
+            </w:r>
+          </w:p>
+        </w:tc>
+        <w:tc>
+          <w:tcPr>
+            <w:tcW w:type="dxa" w:w="1624"/>
+          </w:tcPr>
+          <w:p>
+            <w:pPr>
+              <w:spacing w:after="20"/>
+            </w:pPr>
+            <w:r/>
+            <w:r>
+              <w:rPr>
+                <w:sz w:val="18"/>
+              </w:rPr>
+              <w:t>48.9</w:t>
+            </w:r>
+          </w:p>
+        </w:tc>
+        <w:tc>
+          <w:tcPr>
+            <w:tcW w:type="dxa" w:w="1624"/>
+          </w:tcPr>
+          <w:p>
+            <w:pPr>
+              <w:spacing w:after="20"/>
+            </w:pPr>
+            <w:r/>
+            <w:r>
+              <w:rPr>
+                <w:sz w:val="18"/>
+              </w:rPr>
+              <w:t>34.8</w:t>
+            </w:r>
+          </w:p>
+        </w:tc>
+      </w:tr>
+      <w:tr>
+        <w:tc>
+          <w:tcPr>
+            <w:tcW w:type="dxa" w:w="1624"/>
+          </w:tcPr>
+          <w:p>
+            <w:pPr>
+              <w:spacing w:after="20"/>
+            </w:pPr>
+            <w:r/>
+            <w:r>
+              <w:rPr>
+                <w:sz w:val="18"/>
+              </w:rPr>
+              <w:t>Capable but easily overloaded</w:t>
+            </w:r>
+          </w:p>
+        </w:tc>
+        <w:tc>
+          <w:tcPr>
+            <w:tcW w:type="dxa" w:w="1624"/>
+          </w:tcPr>
+          <w:p>
+            <w:pPr>
+              <w:spacing w:after="20"/>
+            </w:pPr>
+            <w:r/>
+            <w:r>
+              <w:rPr>
+                <w:sz w:val="18"/>
+              </w:rPr>
+              <w:t>7.27</w:t>
+            </w:r>
+          </w:p>
+        </w:tc>
+        <w:tc>
+          <w:tcPr>
+            <w:tcW w:type="dxa" w:w="1624"/>
+          </w:tcPr>
+          <w:p>
+            <w:pPr>
+              <w:spacing w:after="20"/>
+            </w:pPr>
+            <w:r/>
+            <w:r>
+              <w:rPr>
+                <w:sz w:val="18"/>
+              </w:rPr>
+              <w:t>22.82 (&lt;0.001)</w:t>
+            </w:r>
+          </w:p>
+        </w:tc>
+        <w:tc>
+          <w:tcPr>
+            <w:tcW w:type="dxa" w:w="1624"/>
+          </w:tcPr>
+          <w:p>
+            <w:pPr>
+              <w:spacing w:after="20"/>
+            </w:pPr>
+            <w:r/>
+            <w:r>
+              <w:rPr>
+                <w:sz w:val="18"/>
+              </w:rPr>
+              <w:t>12.30 (0.012)</w:t>
+            </w:r>
+          </w:p>
+        </w:tc>
+        <w:tc>
+          <w:tcPr>
+            <w:tcW w:type="dxa" w:w="1624"/>
+          </w:tcPr>
+          <w:p>
+            <w:pPr>
+              <w:spacing w:after="20"/>
+            </w:pPr>
+            <w:r/>
+            <w:r>
+              <w:rPr>
+                <w:sz w:val="18"/>
+              </w:rPr>
+              <w:t>91.1</w:t>
+            </w:r>
+          </w:p>
+        </w:tc>
+        <w:tc>
+          <w:tcPr>
+            <w:tcW w:type="dxa" w:w="1624"/>
+          </w:tcPr>
+          <w:p>
+            <w:pPr>
+              <w:spacing w:after="20"/>
+            </w:pPr>
+            <w:r/>
+            <w:r>
+              <w:rPr>
+                <w:sz w:val="18"/>
+              </w:rPr>
+              <w:t>85.7</w:t>
+            </w:r>
+          </w:p>
+        </w:tc>
+      </w:tr>
+      <w:tr>
+        <w:tc>
+          <w:tcPr>
+            <w:tcW w:type="dxa" w:w="1624"/>
+          </w:tcPr>
+          <w:p>
+            <w:pPr>
+              <w:spacing w:after="20"/>
+            </w:pPr>
+            <w:r/>
+            <w:r>
+              <w:rPr>
+                <w:sz w:val="18"/>
+              </w:rPr>
+              <w:t>Mixed population of the five</w:t>
+            </w:r>
+          </w:p>
+        </w:tc>
+        <w:tc>
+          <w:tcPr>
+            <w:tcW w:type="dxa" w:w="1624"/>
+          </w:tcPr>
+          <w:p>
+            <w:pPr>
+              <w:spacing w:after="20"/>
+            </w:pPr>
+            <w:r/>
+            <w:r>
+              <w:rPr>
+                <w:sz w:val="18"/>
+              </w:rPr>
+              <w:t>9.47</w:t>
+            </w:r>
+          </w:p>
+        </w:tc>
+        <w:tc>
+          <w:tcPr>
+            <w:tcW w:type="dxa" w:w="1624"/>
+          </w:tcPr>
+          <w:p>
+            <w:pPr>
+              <w:spacing w:after="20"/>
+            </w:pPr>
+            <w:r/>
+            <w:r>
+              <w:rPr>
+                <w:sz w:val="18"/>
+              </w:rPr>
+              <w:t>28.88 (0.002)</w:t>
+            </w:r>
+          </w:p>
+        </w:tc>
+        <w:tc>
+          <w:tcPr>
+            <w:tcW w:type="dxa" w:w="1624"/>
+          </w:tcPr>
+          <w:p>
+            <w:pPr>
+              <w:spacing w:after="20"/>
+            </w:pPr>
+            <w:r/>
+            <w:r>
+              <w:rPr>
+                <w:sz w:val="18"/>
+              </w:rPr>
+              <w:t>14.06 (0.033)</w:t>
+            </w:r>
+          </w:p>
+        </w:tc>
+        <w:tc>
+          <w:tcPr>
+            <w:tcW w:type="dxa" w:w="1624"/>
+          </w:tcPr>
+          <w:p>
+            <w:pPr>
+              <w:spacing w:after="20"/>
+            </w:pPr>
+            <w:r/>
+            <w:r>
+              <w:rPr>
+                <w:sz w:val="18"/>
+              </w:rPr>
+              <w:t>82.0</w:t>
+            </w:r>
+          </w:p>
+        </w:tc>
+        <w:tc>
+          <w:tcPr>
+            <w:tcW w:type="dxa" w:w="1624"/>
+          </w:tcPr>
+          <w:p>
+            <w:pPr>
+              <w:spacing w:after="20"/>
+            </w:pPr>
+            <w:r/>
+            <w:r>
+              <w:rPr>
+                <w:sz w:val="18"/>
+              </w:rPr>
+              <w:t>69.9</w:t>
+            </w:r>
+          </w:p>
+        </w:tc>
+      </w:tr>
+    </w:tbl>
+    <w:p>
+      <w:pPr>
+        <w:spacing w:after="40"/>
+      </w:pPr>
+    </w:p>
+    <w:p>
+      <w:r>
+        <w:t>AURA had the lowest regret in all ten scenarios. It was significantly better than the static app in nine of ten (not when children have no clear preferences, where there is little to find) and than the heuristic baseline in six of ten (not when preferences are weak, very strong or absent). p-values are raw paired Wilcoxon tests, not corrected for the ten scenarios. AURA's retention was higher than the heuristic baseline's in nine of ten scenarios but lower when preferences are strong (91.3 vs 93.0), so a retention advantage over the heuristic is not claimed.</w:t>
       </w:r>
     </w:p>
     <w:p>
@@ -6822,7 +8235,7 @@
         <w:pStyle w:val="ListNumber"/>
       </w:pPr>
       <w:r>
-        <w:t>The 'hierarchical prior' is a fixed Beta(2,2); removing it changed nothing (p = 0.79), so it should be described as weakly informative.</w:t>
+        <w:t>The 'hierarchical prior' is a fixed Beta(2,2); removing it changed nothing (p = 0.34), so it is described as weakly informative.</w:t>
       </w:r>
     </w:p>
     <w:p>
@@ -6838,7 +8251,7 @@
         <w:pStyle w:val="ListNumber"/>
       </w:pPr>
       <w:r>
-        <w:t>A known engine issue (the prior is counted twice in the sampling step) should be fixed and all studies re-run before submission.</w:t>
+        <w:t>The engine's Thompson-sampling step previously counted the prior twice; this was fixed and every simulation study was re-run, so all §6 numbers come from the corrected engine.</w:t>
       </w:r>
     </w:p>
     <w:p>
@@ -6846,7 +8259,7 @@
         <w:pStyle w:val="ListNumber"/>
       </w:pPr>
       <w:r>
-        <w:t>Difficulty adaptation and GenAI assistance have not been evaluated (§6.4, §6.7).</w:t>
+        <w:t>Adaptive difficulty is active in the engine but its effect on learning is not measured, because the simulated child does not model difficulty; GenAI assistance has not been evaluated (§6.4, §6.7). No retention advantage over the heuristic adaptive baseline is claimed (§6.3, §6.8).</w:t>
       </w:r>
     </w:p>
     <w:p>

</xml_diff>